<commit_message>
CuivRézo : livraison du 11/10 soir — station 4.1 « Le chapeau de gendarme » à la méthode « trait au 0 » (X mesuré depuis le raccord ; A, S, B au début des coudes, pile sur le 0 du guide ; tableau par côté), plus d'équerre (H au réglet), porte « 🎬 Le film » (film dessiné de 6 min) ; papier régénéré
Feu vert de Franck : « tu pousses ».

Co-Authored-By: Claude Opus 5.5 <noreply@anthropic.com>
</commit_message>
<xml_diff>
--- a/cuivrezo/papier/CuivRezo-passeport-ELEVE.docx
+++ b/cuivrezo/papier/CuivRezo-passeport-ELEVE.docx
@@ -18983,7 +18983,7 @@
                 <w:sz w:val="28"/>
                 <w:szCs w:val="28"/>
               </w:rPr>
-              <w:t xml:space="preserve">Contrôler à la règle et à l’équerre</w:t>
+              <w:t xml:space="preserve">Contrôler à la règle et au réglet</w:t>
             </w:r>
           </w:p>
         </w:tc>
@@ -19193,7 +19193,7 @@
                 <w:sz w:val="28"/>
                 <w:szCs w:val="28"/>
               </w:rPr>
-              <w:t xml:space="preserve">Tracer M, puis A et B</w:t>
+              <w:t xml:space="preserve">Tracer A, S et B depuis X</w:t>
             </w:r>
           </w:p>
         </w:tc>
@@ -19328,7 +19328,7 @@
                 <w:sz w:val="28"/>
                 <w:szCs w:val="28"/>
               </w:rPr>
-              <w:t xml:space="preserve">M tracé sur X</w:t>
+              <w:t xml:space="preserve">Le chapeau décalé</w:t>
             </w:r>
           </w:p>
         </w:tc>
@@ -19598,7 +19598,7 @@
                 <w:sz w:val="28"/>
                 <w:szCs w:val="28"/>
               </w:rPr>
-              <w:t xml:space="preserve">M tracé sur X, sans le décalage « X → M ».</w:t>
+              <w:t xml:space="preserve">X mal reporté, ou un trait mesuré depuis un autre trait que X, ou du mauvais côté.</w:t>
             </w:r>
           </w:p>
         </w:tc>
@@ -19769,7 +19769,7 @@
                 <w:sz w:val="28"/>
                 <w:szCs w:val="28"/>
               </w:rPr>
-              <w:t xml:space="preserve">A et B pas à la même distance de M, ou cintrés à des angles différents.</w:t>
+              <w:t xml:space="preserve">A ou B pas pile sur le 0 (ou posé sur L ou R), ou cintrés à des angles différents.</w:t>
             </w:r>
           </w:p>
         </w:tc>

</xml_diff>